<commit_message>
provided AI prompt history
</commit_message>
<xml_diff>
--- a/AI Use Declaration Form.docx
+++ b/AI Use Declaration Form.docx
@@ -175,7 +175,31 @@
         <w:rPr>
           <w:rFonts w:ascii="Times New Roman" w:hAnsi="Times New Roman" w:cs="Times New Roman"/>
         </w:rPr>
-        <w:t xml:space="preserve"> ___</w:t>
+        <w:t xml:space="preserve"> __</w:t>
+      </w:r>
+      <w:r>
+        <w:rPr>
+          <w:rFonts w:ascii="Times New Roman" w:hAnsi="Times New Roman" w:cs="Times New Roman"/>
+        </w:rPr>
+        <w:t>1</w:t>
+      </w:r>
+      <w:r>
+        <w:rPr>
+          <w:rFonts w:ascii="Times New Roman" w:hAnsi="Times New Roman" w:cs="Times New Roman"/>
+        </w:rPr>
+        <w:t>7</w:t>
+      </w:r>
+      <w:r>
+        <w:rPr>
+          <w:rFonts w:ascii="Times New Roman" w:hAnsi="Times New Roman" w:cs="Times New Roman"/>
+        </w:rPr>
+        <w:t>th</w:t>
+      </w:r>
+      <w:r>
+        <w:rPr>
+          <w:rFonts w:ascii="Times New Roman" w:hAnsi="Times New Roman" w:cs="Times New Roman"/>
+        </w:rPr>
+        <w:t>_</w:t>
       </w:r>
       <w:r>
         <w:rPr>
@@ -351,21 +375,7 @@
               <w:rPr>
                 <w:rFonts w:ascii="Times New Roman" w:hAnsi="Times New Roman" w:cs="Times New Roman"/>
               </w:rPr>
-              <w:t xml:space="preserve">Estimated percentage of </w:t>
-            </w:r>
-            <w:proofErr w:type="gramStart"/>
-            <w:r>
-              <w:rPr>
-                <w:rFonts w:ascii="Times New Roman" w:hAnsi="Times New Roman" w:cs="Times New Roman"/>
-              </w:rPr>
-              <w:t>the work</w:t>
-            </w:r>
-            <w:proofErr w:type="gramEnd"/>
-            <w:r>
-              <w:rPr>
-                <w:rFonts w:ascii="Times New Roman" w:hAnsi="Times New Roman" w:cs="Times New Roman"/>
-              </w:rPr>
-              <w:t xml:space="preserve"> influenced by AI</w:t>
+              <w:t>Estimated percentage of the work influenced by AI</w:t>
             </w:r>
           </w:p>
         </w:tc>
@@ -661,127 +671,7 @@
               <w:rPr>
                 <w:rFonts w:ascii="Times New Roman" w:hAnsi="Times New Roman" w:cs="Times New Roman"/>
               </w:rPr>
-              <w:t>Provided error stack traces: "</w:t>
-            </w:r>
-            <w:proofErr w:type="spellStart"/>
-            <w:r>
-              <w:rPr>
-                <w:rFonts w:ascii="Times New Roman" w:hAnsi="Times New Roman" w:cs="Times New Roman"/>
-              </w:rPr>
-              <w:t>TypeError</w:t>
-            </w:r>
-            <w:proofErr w:type="spellEnd"/>
-            <w:r>
-              <w:rPr>
-                <w:rFonts w:ascii="Times New Roman" w:hAnsi="Times New Roman" w:cs="Times New Roman"/>
-              </w:rPr>
-              <w:t xml:space="preserve">: 'method' object is not </w:t>
-            </w:r>
-            <w:proofErr w:type="spellStart"/>
-            <w:r>
-              <w:rPr>
-                <w:rFonts w:ascii="Times New Roman" w:hAnsi="Times New Roman" w:cs="Times New Roman"/>
-              </w:rPr>
-              <w:t>iterable</w:t>
-            </w:r>
-            <w:proofErr w:type="spellEnd"/>
-            <w:r>
-              <w:rPr>
-                <w:rFonts w:ascii="Times New Roman" w:hAnsi="Times New Roman" w:cs="Times New Roman"/>
-              </w:rPr>
-              <w:t>", "</w:t>
-            </w:r>
-            <w:proofErr w:type="spellStart"/>
-            <w:r>
-              <w:rPr>
-                <w:rFonts w:ascii="Times New Roman" w:hAnsi="Times New Roman" w:cs="Times New Roman"/>
-              </w:rPr>
-              <w:t>AttributeError</w:t>
-            </w:r>
-            <w:proofErr w:type="spellEnd"/>
-            <w:r>
-              <w:rPr>
-                <w:rFonts w:ascii="Times New Roman" w:hAnsi="Times New Roman" w:cs="Times New Roman"/>
-              </w:rPr>
-              <w:t>: 'set' object has no attribute 'append'", and "</w:t>
-            </w:r>
-            <w:proofErr w:type="spellStart"/>
-            <w:r>
-              <w:rPr>
-                <w:rFonts w:ascii="Times New Roman" w:hAnsi="Times New Roman" w:cs="Times New Roman"/>
-              </w:rPr>
-              <w:t>TypeError</w:t>
-            </w:r>
-            <w:proofErr w:type="spellEnd"/>
-            <w:r>
-              <w:rPr>
-                <w:rFonts w:ascii="Times New Roman" w:hAnsi="Times New Roman" w:cs="Times New Roman"/>
-              </w:rPr>
-              <w:t xml:space="preserve">: </w:t>
-            </w:r>
-            <w:proofErr w:type="spellStart"/>
-            <w:proofErr w:type="gramStart"/>
-            <w:r>
-              <w:rPr>
-                <w:rFonts w:ascii="Times New Roman" w:hAnsi="Times New Roman" w:cs="Times New Roman"/>
-              </w:rPr>
-              <w:t>SearchResult</w:t>
-            </w:r>
-            <w:proofErr w:type="spellEnd"/>
-            <w:r>
-              <w:rPr>
-                <w:rFonts w:ascii="Times New Roman" w:hAnsi="Times New Roman" w:cs="Times New Roman"/>
-              </w:rPr>
-              <w:t>._</w:t>
-            </w:r>
-            <w:proofErr w:type="gramEnd"/>
-            <w:r>
-              <w:rPr>
-                <w:rFonts w:ascii="Times New Roman" w:hAnsi="Times New Roman" w:cs="Times New Roman"/>
-              </w:rPr>
-              <w:t>_</w:t>
-            </w:r>
-            <w:proofErr w:type="spellStart"/>
-            <w:r>
-              <w:rPr>
-                <w:rFonts w:ascii="Times New Roman" w:hAnsi="Times New Roman" w:cs="Times New Roman"/>
-              </w:rPr>
-              <w:t>init</w:t>
-            </w:r>
-            <w:proofErr w:type="spellEnd"/>
-            <w:r>
-              <w:rPr>
-                <w:rFonts w:ascii="Times New Roman" w:hAnsi="Times New Roman" w:cs="Times New Roman"/>
-              </w:rPr>
-              <w:t>_</w:t>
-            </w:r>
-            <w:proofErr w:type="gramStart"/>
-            <w:r>
-              <w:rPr>
-                <w:rFonts w:ascii="Times New Roman" w:hAnsi="Times New Roman" w:cs="Times New Roman"/>
-              </w:rPr>
-              <w:t>_(</w:t>
-            </w:r>
-            <w:proofErr w:type="gramEnd"/>
-            <w:r>
-              <w:rPr>
-                <w:rFonts w:ascii="Times New Roman" w:hAnsi="Times New Roman" w:cs="Times New Roman"/>
-              </w:rPr>
-              <w:t>) got unexpected keyword argument '</w:t>
-            </w:r>
-            <w:proofErr w:type="spellStart"/>
-            <w:r>
-              <w:rPr>
-                <w:rFonts w:ascii="Times New Roman" w:hAnsi="Times New Roman" w:cs="Times New Roman"/>
-              </w:rPr>
-              <w:t>solution_cost</w:t>
-            </w:r>
-            <w:proofErr w:type="spellEnd"/>
-            <w:r>
-              <w:rPr>
-                <w:rFonts w:ascii="Times New Roman" w:hAnsi="Times New Roman" w:cs="Times New Roman"/>
-              </w:rPr>
-              <w:t>'".</w:t>
+              <w:t>Provided error stack traces: "TypeError: 'method' object is not iterable", "AttributeError: 'set' object has no attribute 'append'", and "TypeError: SearchResult.__init__() got unexpected keyword argument 'solution_cost'".</w:t>
             </w:r>
           </w:p>
         </w:tc>
@@ -800,49 +690,7 @@
               <w:rPr>
                 <w:rFonts w:ascii="Times New Roman" w:hAnsi="Times New Roman" w:cs="Times New Roman"/>
               </w:rPr>
-              <w:t xml:space="preserve">Code blocks for </w:t>
-            </w:r>
-            <w:proofErr w:type="spellStart"/>
-            <w:r>
-              <w:rPr>
-                <w:rFonts w:ascii="Times New Roman" w:hAnsi="Times New Roman" w:cs="Times New Roman"/>
-              </w:rPr>
-              <w:t>SearchAlgorithm.expand</w:t>
-            </w:r>
-            <w:proofErr w:type="spellEnd"/>
-            <w:r>
-              <w:rPr>
-                <w:rFonts w:ascii="Times New Roman" w:hAnsi="Times New Roman" w:cs="Times New Roman"/>
-              </w:rPr>
-              <w:t xml:space="preserve">, </w:t>
-            </w:r>
-            <w:proofErr w:type="spellStart"/>
-            <w:r>
-              <w:rPr>
-                <w:rFonts w:ascii="Times New Roman" w:hAnsi="Times New Roman" w:cs="Times New Roman"/>
-              </w:rPr>
-              <w:t>BreadthFirstSearch.search</w:t>
-            </w:r>
-            <w:proofErr w:type="spellEnd"/>
-            <w:r>
-              <w:rPr>
-                <w:rFonts w:ascii="Times New Roman" w:hAnsi="Times New Roman" w:cs="Times New Roman"/>
-              </w:rPr>
-              <w:t xml:space="preserve">, and </w:t>
-            </w:r>
-            <w:proofErr w:type="spellStart"/>
-            <w:r>
-              <w:rPr>
-                <w:rFonts w:ascii="Times New Roman" w:hAnsi="Times New Roman" w:cs="Times New Roman"/>
-              </w:rPr>
-              <w:t>DepthFirstSearch.search</w:t>
-            </w:r>
-            <w:proofErr w:type="spellEnd"/>
-            <w:r>
-              <w:rPr>
-                <w:rFonts w:ascii="Times New Roman" w:hAnsi="Times New Roman" w:cs="Times New Roman"/>
-              </w:rPr>
-              <w:t>.</w:t>
+              <w:t>Code blocks for SearchAlgorithm.expand, BreadthFirstSearch.search, and DepthFirstSearch.search.</w:t>
             </w:r>
           </w:p>
         </w:tc>
@@ -861,91 +709,7 @@
               <w:rPr>
                 <w:rFonts w:ascii="Times New Roman" w:hAnsi="Times New Roman" w:cs="Times New Roman"/>
               </w:rPr>
-              <w:t xml:space="preserve">I traced the errors back to the source </w:t>
-            </w:r>
-            <w:proofErr w:type="spellStart"/>
-            <w:r>
-              <w:rPr>
-                <w:rFonts w:ascii="Times New Roman" w:hAnsi="Times New Roman" w:cs="Times New Roman"/>
-              </w:rPr>
-              <w:t>dataclasses</w:t>
-            </w:r>
-            <w:proofErr w:type="spellEnd"/>
-            <w:r>
-              <w:rPr>
-                <w:rFonts w:ascii="Times New Roman" w:hAnsi="Times New Roman" w:cs="Times New Roman"/>
-              </w:rPr>
-              <w:t xml:space="preserve">. I changed list operations to </w:t>
-            </w:r>
-            <w:proofErr w:type="gramStart"/>
-            <w:r>
-              <w:rPr>
-                <w:rFonts w:ascii="Times New Roman" w:hAnsi="Times New Roman" w:cs="Times New Roman"/>
-              </w:rPr>
-              <w:t>set .add</w:t>
-            </w:r>
-            <w:proofErr w:type="gramEnd"/>
-            <w:r>
-              <w:rPr>
-                <w:rFonts w:ascii="Times New Roman" w:hAnsi="Times New Roman" w:cs="Times New Roman"/>
-              </w:rPr>
-              <w:t xml:space="preserve">() calls, removed the </w:t>
-            </w:r>
-            <w:proofErr w:type="gramStart"/>
-            <w:r>
-              <w:rPr>
-                <w:rFonts w:ascii="Times New Roman" w:hAnsi="Times New Roman" w:cs="Times New Roman"/>
-              </w:rPr>
-              <w:t>automated @</w:t>
-            </w:r>
-            <w:proofErr w:type="gramEnd"/>
-            <w:r>
-              <w:rPr>
-                <w:rFonts w:ascii="Times New Roman" w:hAnsi="Times New Roman" w:cs="Times New Roman"/>
-              </w:rPr>
-              <w:t>property values (</w:t>
-            </w:r>
-            <w:proofErr w:type="spellStart"/>
-            <w:r>
-              <w:rPr>
-                <w:rFonts w:ascii="Times New Roman" w:hAnsi="Times New Roman" w:cs="Times New Roman"/>
-              </w:rPr>
-              <w:t>solution_cost</w:t>
-            </w:r>
-            <w:proofErr w:type="spellEnd"/>
-            <w:r>
-              <w:rPr>
-                <w:rFonts w:ascii="Times New Roman" w:hAnsi="Times New Roman" w:cs="Times New Roman"/>
-              </w:rPr>
-              <w:t xml:space="preserve">, </w:t>
-            </w:r>
-            <w:proofErr w:type="spellStart"/>
-            <w:r>
-              <w:rPr>
-                <w:rFonts w:ascii="Times New Roman" w:hAnsi="Times New Roman" w:cs="Times New Roman"/>
-              </w:rPr>
-              <w:t>solution_depth</w:t>
-            </w:r>
-            <w:proofErr w:type="spellEnd"/>
-            <w:r>
-              <w:rPr>
-                <w:rFonts w:ascii="Times New Roman" w:hAnsi="Times New Roman" w:cs="Times New Roman"/>
-              </w:rPr>
-              <w:t xml:space="preserve">) from being passed incorrectly into the constructor, and deleted the misplaced raise </w:t>
-            </w:r>
-            <w:proofErr w:type="spellStart"/>
-            <w:r>
-              <w:rPr>
-                <w:rFonts w:ascii="Times New Roman" w:hAnsi="Times New Roman" w:cs="Times New Roman"/>
-              </w:rPr>
-              <w:t>NotImplementedError</w:t>
-            </w:r>
-            <w:proofErr w:type="spellEnd"/>
-            <w:r>
-              <w:rPr>
-                <w:rFonts w:ascii="Times New Roman" w:hAnsi="Times New Roman" w:cs="Times New Roman"/>
-              </w:rPr>
-              <w:t xml:space="preserve"> lines that broke the generator stream.</w:t>
+              <w:t>I traced the errors back to the source dataclasses. I changed list operations to set .add() calls, removed the automated @property values (solution_cost, solution_depth) from being passed incorrectly into the constructor, and deleted the misplaced raise NotImplementedError lines that broke the generator stream.</w:t>
             </w:r>
           </w:p>
         </w:tc>
@@ -1023,32 +787,8 @@
               <w:rPr>
                 <w:rFonts w:ascii="Times New Roman" w:hAnsi="Times New Roman" w:cs="Times New Roman"/>
               </w:rPr>
-              <w:t xml:space="preserve">Code block for </w:t>
-            </w:r>
-            <w:proofErr w:type="spellStart"/>
-            <w:proofErr w:type="gramStart"/>
-            <w:r>
-              <w:rPr>
-                <w:rFonts w:ascii="Times New Roman" w:hAnsi="Times New Roman" w:cs="Times New Roman"/>
-              </w:rPr>
-              <w:t>DepthLimitedSearch</w:t>
-            </w:r>
-            <w:proofErr w:type="spellEnd"/>
-            <w:r>
-              <w:rPr>
-                <w:rFonts w:ascii="Times New Roman" w:hAnsi="Times New Roman" w:cs="Times New Roman"/>
-              </w:rPr>
-              <w:t>._</w:t>
-            </w:r>
-            <w:proofErr w:type="spellStart"/>
-            <w:proofErr w:type="gramEnd"/>
-            <w:r>
-              <w:rPr>
-                <w:rFonts w:ascii="Times New Roman" w:hAnsi="Times New Roman" w:cs="Times New Roman"/>
-              </w:rPr>
-              <w:t>recursive_dls</w:t>
-            </w:r>
-            <w:proofErr w:type="spellEnd"/>
+              <w:t>Code block for DepthLimitedSearch._recursive_dls</w:t>
+            </w:r>
           </w:p>
         </w:tc>
         <w:tc>
@@ -1065,21 +805,7 @@
               <w:rPr>
                 <w:rFonts w:ascii="Times New Roman" w:hAnsi="Times New Roman" w:cs="Times New Roman"/>
               </w:rPr>
-              <w:t xml:space="preserve">I verified the code logic against textbook AIMA search architecture. I corrected single-equals assignment operations to conditional checking operators (==), modified the recursive frame parameters to pass the unique child nodes instead of the global </w:t>
-            </w:r>
-            <w:proofErr w:type="spellStart"/>
-            <w:r>
-              <w:rPr>
-                <w:rFonts w:ascii="Times New Roman" w:hAnsi="Times New Roman" w:cs="Times New Roman"/>
-              </w:rPr>
-              <w:t>initial_node</w:t>
-            </w:r>
-            <w:proofErr w:type="spellEnd"/>
-            <w:r>
-              <w:rPr>
-                <w:rFonts w:ascii="Times New Roman" w:hAnsi="Times New Roman" w:cs="Times New Roman"/>
-              </w:rPr>
-              <w:t xml:space="preserve"> to avoid an infinite loop, and implemented parent pointer loops to block state cycles.</w:t>
+              <w:t>I verified the code logic against textbook AIMA search architecture. I corrected single-equals assignment operations to conditional checking operators (==), modified the recursive frame parameters to pass the unique child nodes instead of the global initial_node to avoid an infinite loop, and implemented parent pointer loops to block state cycles.</w:t>
             </w:r>
           </w:p>
         </w:tc>
@@ -1398,6 +1124,30 @@
               </w:rPr>
               <w:t>AI_Prompt_History_Lab1A.txt</w:t>
             </w:r>
+            <w:r>
+              <w:rPr>
+                <w:rFonts w:ascii="Times New Roman" w:hAnsi="Times New Roman" w:cs="Times New Roman"/>
+              </w:rPr>
+              <w:t xml:space="preserve"> , </w:t>
+            </w:r>
+            <w:r>
+              <w:rPr>
+                <w:rFonts w:ascii="Times New Roman" w:hAnsi="Times New Roman" w:cs="Times New Roman"/>
+              </w:rPr>
+              <w:t>AI_Prompt_History_Lab1</w:t>
+            </w:r>
+            <w:r>
+              <w:rPr>
+                <w:rFonts w:ascii="Times New Roman" w:hAnsi="Times New Roman" w:cs="Times New Roman"/>
+              </w:rPr>
+              <w:t>B</w:t>
+            </w:r>
+            <w:r>
+              <w:rPr>
+                <w:rFonts w:ascii="Times New Roman" w:hAnsi="Times New Roman" w:cs="Times New Roman"/>
+              </w:rPr>
+              <w:t>.txt</w:t>
+            </w:r>
           </w:p>
         </w:tc>
       </w:tr>
@@ -1628,16 +1378,32 @@
               <w:rPr>
                 <w:rFonts w:ascii="Times New Roman" w:hAnsi="Times New Roman" w:cs="Times New Roman"/>
               </w:rPr>
+              <w:t>Kekeli_Agblobi_Lab_1A.ipynb</w:t>
+            </w:r>
+            <w:r>
+              <w:rPr>
+                <w:rFonts w:ascii="Times New Roman" w:hAnsi="Times New Roman" w:cs="Times New Roman"/>
+              </w:rPr>
+              <w:t xml:space="preserve">, </w:t>
+            </w:r>
+            <w:r>
+              <w:rPr>
+                <w:rFonts w:ascii="Times New Roman" w:hAnsi="Times New Roman" w:cs="Times New Roman"/>
+              </w:rPr>
               <w:t>Kekeli_Agblobi_Lab_1</w:t>
             </w:r>
-            <w:proofErr w:type="gramStart"/>
-            <w:r>
-              <w:rPr>
-                <w:rFonts w:ascii="Times New Roman" w:hAnsi="Times New Roman" w:cs="Times New Roman"/>
-              </w:rPr>
-              <w:t>A.ipynb</w:t>
-            </w:r>
-            <w:proofErr w:type="gramEnd"/>
+            <w:r>
+              <w:rPr>
+                <w:rFonts w:ascii="Times New Roman" w:hAnsi="Times New Roman" w:cs="Times New Roman"/>
+              </w:rPr>
+              <w:t>B</w:t>
+            </w:r>
+            <w:r>
+              <w:rPr>
+                <w:rFonts w:ascii="Times New Roman" w:hAnsi="Times New Roman" w:cs="Times New Roman"/>
+              </w:rPr>
+              <w:t>.ipynb</w:t>
+            </w:r>
           </w:p>
         </w:tc>
       </w:tr>
@@ -1760,6 +1526,7 @@
               <w:rPr>
                 <w:rFonts w:ascii="Times New Roman" w:hAnsi="Times New Roman" w:cs="Times New Roman"/>
               </w:rPr>
+              <w:lastRenderedPageBreak/>
               <w:t>The submitted work is my own work.</w:t>
             </w:r>
           </w:p>
@@ -1838,7 +1605,6 @@
               <w:rPr>
                 <w:rFonts w:ascii="Times New Roman" w:hAnsi="Times New Roman" w:cs="Times New Roman"/>
               </w:rPr>
-              <w:lastRenderedPageBreak/>
               <w:t>The prompts, instructions, and AI-generated outputs have been disclosed where applicable.</w:t>
             </w:r>
           </w:p>
@@ -2006,7 +1772,6 @@
         </w:rPr>
         <w:t xml:space="preserve"> ________</w:t>
       </w:r>
-      <w:proofErr w:type="spellStart"/>
       <w:r>
         <w:rPr>
           <w:rFonts w:ascii="Times New Roman" w:hAnsi="Times New Roman" w:cs="Times New Roman"/>
@@ -2014,7 +1779,6 @@
         </w:rPr>
         <w:t>KekeliAgblobi</w:t>
       </w:r>
-      <w:proofErr w:type="spellEnd"/>
       <w:r>
         <w:rPr>
           <w:rFonts w:ascii="Times New Roman" w:hAnsi="Times New Roman" w:cs="Times New Roman"/>
@@ -2688,7 +2452,6 @@
   <w:style w:type="character" w:default="1" w:styleId="DefaultParagraphFont">
     <w:name w:val="Default Paragraph Font"/>
     <w:uiPriority w:val="1"/>
-    <w:semiHidden/>
     <w:unhideWhenUsed/>
   </w:style>
   <w:style w:type="table" w:default="1" w:styleId="TableNormal">

</xml_diff>